<commit_message>
moved files, slight wording change in fig 7 legend
</commit_message>
<xml_diff>
--- a/ms-2026-05-25v2.docx
+++ b/ms-2026-05-25v2.docx
@@ -2898,15 +2898,7 @@
       </w:pPr>
       <w:r>
         <w:rPr/>
-        <w:t xml:space="preserve">Cells with RNase H2 deficiency cannot efficiently remove ribonucleotides that had previously been incorporated into genomic DNA, and this sets the stage for topoisomerase-1 (TOP1) associated mutagenesis. This was previously </w:t>
-      </w:r>
-      <w:r>
-        <w:rPr/>
-        <w:t>proposed</w:t>
-      </w:r>
-      <w:r>
-        <w:rPr/>
-        <w:t xml:space="preserve"> to generate indel signature ID4 </w:t>
+        <w:t xml:space="preserve">Cells with RNase H2 deficiency cannot efficiently remove ribonucleotides that had previously been incorporated into genomic DNA, and this sets the stage for topoisomerase-1 (TOP1) associated mutagenesis. This was previously proposed to generate indel signature ID4 </w:t>
       </w:r>
       <w:bookmarkStart w:id="17" w:name="ZOTERO_BREF_xeDB1zkV4c3y"/>
       <w:r>
@@ -2929,46 +2921,33 @@
           <w:rFonts w:eastAsia="宋体" w:hint="eastAsia"/>
           <w:shd w:fill="FFFF00" w:val="clear"/>
         </w:rPr>
-        <w:t xml:space="preserve"> </w:t>
+        <w:t xml:space="preserve"> 7</w:t>
+      </w:r>
+      <w:r>
+        <w:rPr>
+          <w:shd w:fill="FFFF00" w:val="clear"/>
+        </w:rPr>
+        <w:t>)</w:t>
+      </w:r>
+      <w:r>
+        <w:rPr/>
+        <w:t xml:space="preserve">. The profile of deletions of </w:t>
+      </w:r>
+      <w:r>
+        <w:rPr>
+          <w:rFonts w:eastAsia="Liberation Serif" w:cs="Liberation Serif" w:ascii="Liberation Serif" w:hAnsi="Liberation Serif"/>
+        </w:rPr>
+        <w:t>≥</w:t>
+      </w:r>
+      <w:r>
+        <w:rPr/>
+        <w:t>2 bases is very different between InsDel_F and ID4: InsDel_F has distinctively high proportions of (i) 2-base deletions with microhomology (almost all TCT → T or TGT → T) and (ii) 2-base deletions from paired 2-base doublets (most often CTCT → CT). InsDel4 has much lower proportions of these two deletion types and also has additional prominent deletion types that are essentially absent in InsDel_F. Theses additional deletion types are mainly deletions of 3 or 4 bases with microhomology and deletions of 3 or 4 bases from paired doublets (e.g. TCTTCT → TCT, GTTTGTTT → GTTT). The spectra in RNase H2 deficient cell lines consist of signatures due to mutational processes intrinsic to the parental cell line combined with high proportions of mutations characteristic of InsDel_F</w:t>
       </w:r>
       <w:r>
         <w:rPr>
           <w:rFonts w:eastAsia="宋体" w:hint="eastAsia"/>
-          <w:shd w:fill="FFFF00" w:val="clear"/>
-        </w:rPr>
-        <w:t>7</w:t>
-      </w:r>
-      <w:r>
-        <w:rPr>
-          <w:shd w:fill="FFFF00" w:val="clear"/>
-        </w:rPr>
-        <w:t>)</w:t>
-      </w:r>
-      <w:r>
-        <w:rPr/>
-        <w:t xml:space="preserve">. The profile of deletions of </w:t>
-      </w:r>
-      <w:r>
-        <w:rPr>
-          <w:rFonts w:eastAsia="Liberation Serif" w:cs="Liberation Serif" w:ascii="Liberation Serif" w:hAnsi="Liberation Serif"/>
-        </w:rPr>
-        <w:t>≥</w:t>
-      </w:r>
-      <w:r>
-        <w:rPr/>
-        <w:t>2 bases is very different between InsDel_F and ID4: InsDel_F has distinctively high proportions of (i) 2-base deletions with microhomology (almost all TCT → T or TGT → T) and (ii) 2-base deletions from paired 2-base doublets (most often CTCT → CT). InsDel4 has much lower proportions of these two deletion types and also has additional prominent deletion types that are essentially absent in InsDel_F. Theses additional deletion types are mainly deletions of 3 or 4 bases with microhomology and deletions of 3 or 4 bases from paired doublets (e.g. TCTTCT → TCT, GTTTGTTT → GTTT). The spectra in RNase H2 deficient cell lines consist of signatures due to mutational processes intrinsic to the parental cell line combined with high proportions of mutations characteristic of InsDel_F</w:t>
-      </w:r>
-      <w:r>
-        <w:rPr>
-          <w:rFonts w:eastAsia="宋体" w:hint="eastAsia"/>
-        </w:rPr>
-        <w:t xml:space="preserve"> (</w:t>
-      </w:r>
-      <w:r>
-        <w:rPr>
-          <w:rFonts w:eastAsia="宋体" w:hint="eastAsia"/>
-        </w:rPr>
-        <w:t xml:space="preserve">DO NOT NEED: </w:t>
+        </w:rPr>
+        <w:t xml:space="preserve"> (DO NOT NEED: </w:t>
       </w:r>
       <w:r>
         <w:rPr>
@@ -5414,9 +5393,9 @@
       <w:tblGrid>
         <w:gridCol w:w="1271"/>
         <w:gridCol w:w="1558"/>
-        <w:gridCol w:w="1418"/>
+        <w:gridCol w:w="1417"/>
         <w:gridCol w:w="870"/>
-        <w:gridCol w:w="1399"/>
+        <w:gridCol w:w="1400"/>
         <w:gridCol w:w="1009"/>
         <w:gridCol w:w="916"/>
         <w:gridCol w:w="905"/>
@@ -5533,7 +5512,7 @@
         </w:tc>
         <w:tc>
           <w:tcPr>
-            <w:tcW w:w="1418" w:type="dxa"/>
+            <w:tcW w:w="1417" w:type="dxa"/>
             <w:tcBorders>
               <w:top w:val="single" w:sz="4" w:space="0" w:color="999999"/>
               <w:start w:val="single" w:sz="4" w:space="0" w:color="999999"/>
@@ -5655,7 +5634,7 @@
         </w:tc>
         <w:tc>
           <w:tcPr>
-            <w:tcW w:w="1399" w:type="dxa"/>
+            <w:tcW w:w="1400" w:type="dxa"/>
             <w:tcBorders>
               <w:top w:val="single" w:sz="4" w:space="0" w:color="999999"/>
               <w:start w:val="single" w:sz="4" w:space="0" w:color="999999"/>
@@ -5890,7 +5869,7 @@
         </w:tc>
         <w:tc>
           <w:tcPr>
-            <w:tcW w:w="1418" w:type="dxa"/>
+            <w:tcW w:w="1417" w:type="dxa"/>
             <w:tcBorders>
               <w:top w:val="single" w:sz="4" w:space="0" w:color="999999"/>
               <w:start w:val="single" w:sz="4" w:space="0" w:color="999999"/>
@@ -5960,7 +5939,7 @@
         </w:tc>
         <w:tc>
           <w:tcPr>
-            <w:tcW w:w="1399" w:type="dxa"/>
+            <w:tcW w:w="1400" w:type="dxa"/>
             <w:tcBorders>
               <w:top w:val="single" w:sz="4" w:space="0" w:color="999999"/>
               <w:start w:val="single" w:sz="4" w:space="0" w:color="999999"/>
@@ -6183,7 +6162,7 @@
         </w:tc>
         <w:tc>
           <w:tcPr>
-            <w:tcW w:w="1418" w:type="dxa"/>
+            <w:tcW w:w="1417" w:type="dxa"/>
             <w:tcBorders>
               <w:top w:val="single" w:sz="4" w:space="0" w:color="999999"/>
               <w:start w:val="single" w:sz="4" w:space="0" w:color="999999"/>
@@ -6255,7 +6234,7 @@
         </w:tc>
         <w:tc>
           <w:tcPr>
-            <w:tcW w:w="1399" w:type="dxa"/>
+            <w:tcW w:w="1400" w:type="dxa"/>
             <w:tcBorders>
               <w:top w:val="single" w:sz="4" w:space="0" w:color="999999"/>
               <w:start w:val="single" w:sz="4" w:space="0" w:color="999999"/>
@@ -6463,7 +6442,7 @@
         </w:tc>
         <w:tc>
           <w:tcPr>
-            <w:tcW w:w="1418" w:type="dxa"/>
+            <w:tcW w:w="1417" w:type="dxa"/>
             <w:tcBorders>
               <w:top w:val="single" w:sz="4" w:space="0" w:color="999999"/>
               <w:start w:val="single" w:sz="4" w:space="0" w:color="999999"/>
@@ -6533,7 +6512,7 @@
         </w:tc>
         <w:tc>
           <w:tcPr>
-            <w:tcW w:w="1399" w:type="dxa"/>
+            <w:tcW w:w="1400" w:type="dxa"/>
             <w:tcBorders>
               <w:top w:val="single" w:sz="4" w:space="0" w:color="999999"/>
               <w:start w:val="single" w:sz="4" w:space="0" w:color="999999"/>
@@ -6740,7 +6719,7 @@
         </w:tc>
         <w:tc>
           <w:tcPr>
-            <w:tcW w:w="1418" w:type="dxa"/>
+            <w:tcW w:w="1417" w:type="dxa"/>
             <w:tcBorders>
               <w:top w:val="single" w:sz="4" w:space="0" w:color="999999"/>
               <w:start w:val="single" w:sz="4" w:space="0" w:color="999999"/>
@@ -6810,7 +6789,7 @@
         </w:tc>
         <w:tc>
           <w:tcPr>
-            <w:tcW w:w="1399" w:type="dxa"/>
+            <w:tcW w:w="1400" w:type="dxa"/>
             <w:tcBorders>
               <w:top w:val="single" w:sz="4" w:space="0" w:color="999999"/>
               <w:start w:val="single" w:sz="4" w:space="0" w:color="999999"/>
@@ -7033,7 +7012,7 @@
         </w:tc>
         <w:tc>
           <w:tcPr>
-            <w:tcW w:w="1418" w:type="dxa"/>
+            <w:tcW w:w="1417" w:type="dxa"/>
             <w:tcBorders>
               <w:top w:val="single" w:sz="4" w:space="0" w:color="999999"/>
               <w:start w:val="single" w:sz="4" w:space="0" w:color="999999"/>
@@ -7104,7 +7083,7 @@
         </w:tc>
         <w:tc>
           <w:tcPr>
-            <w:tcW w:w="1399" w:type="dxa"/>
+            <w:tcW w:w="1400" w:type="dxa"/>
             <w:tcBorders>
               <w:top w:val="single" w:sz="4" w:space="0" w:color="999999"/>
               <w:start w:val="single" w:sz="4" w:space="0" w:color="999999"/>
@@ -7309,7 +7288,7 @@
         </w:tc>
         <w:tc>
           <w:tcPr>
-            <w:tcW w:w="1418" w:type="dxa"/>
+            <w:tcW w:w="1417" w:type="dxa"/>
             <w:tcBorders>
               <w:top w:val="single" w:sz="4" w:space="0" w:color="999999"/>
               <w:start w:val="single" w:sz="4" w:space="0" w:color="999999"/>
@@ -7379,7 +7358,7 @@
         </w:tc>
         <w:tc>
           <w:tcPr>
-            <w:tcW w:w="1399" w:type="dxa"/>
+            <w:tcW w:w="1400" w:type="dxa"/>
             <w:tcBorders>
               <w:top w:val="single" w:sz="4" w:space="0" w:color="999999"/>
               <w:start w:val="single" w:sz="4" w:space="0" w:color="999999"/>
@@ -7584,7 +7563,7 @@
         </w:tc>
         <w:tc>
           <w:tcPr>
-            <w:tcW w:w="1418" w:type="dxa"/>
+            <w:tcW w:w="1417" w:type="dxa"/>
             <w:tcBorders>
               <w:top w:val="single" w:sz="4" w:space="0" w:color="999999"/>
               <w:start w:val="single" w:sz="4" w:space="0" w:color="999999"/>
@@ -7654,7 +7633,7 @@
         </w:tc>
         <w:tc>
           <w:tcPr>
-            <w:tcW w:w="1399" w:type="dxa"/>
+            <w:tcW w:w="1400" w:type="dxa"/>
             <w:tcBorders>
               <w:top w:val="single" w:sz="4" w:space="0" w:color="999999"/>
               <w:start w:val="single" w:sz="4" w:space="0" w:color="999999"/>
@@ -7875,7 +7854,7 @@
         </w:tc>
         <w:tc>
           <w:tcPr>
-            <w:tcW w:w="1418" w:type="dxa"/>
+            <w:tcW w:w="1417" w:type="dxa"/>
             <w:tcBorders>
               <w:top w:val="single" w:sz="4" w:space="0" w:color="999999"/>
               <w:start w:val="single" w:sz="4" w:space="0" w:color="999999"/>
@@ -7947,7 +7926,7 @@
         </w:tc>
         <w:tc>
           <w:tcPr>
-            <w:tcW w:w="1399" w:type="dxa"/>
+            <w:tcW w:w="1400" w:type="dxa"/>
             <w:tcBorders>
               <w:top w:val="single" w:sz="4" w:space="0" w:color="999999"/>
               <w:start w:val="single" w:sz="4" w:space="0" w:color="999999"/>
@@ -8155,7 +8134,7 @@
         </w:tc>
         <w:tc>
           <w:tcPr>
-            <w:tcW w:w="1418" w:type="dxa"/>
+            <w:tcW w:w="1417" w:type="dxa"/>
             <w:tcBorders>
               <w:top w:val="single" w:sz="4" w:space="0" w:color="999999"/>
               <w:start w:val="single" w:sz="4" w:space="0" w:color="999999"/>
@@ -8225,7 +8204,7 @@
         </w:tc>
         <w:tc>
           <w:tcPr>
-            <w:tcW w:w="1399" w:type="dxa"/>
+            <w:tcW w:w="1400" w:type="dxa"/>
             <w:tcBorders>
               <w:top w:val="single" w:sz="4" w:space="0" w:color="999999"/>
               <w:start w:val="single" w:sz="4" w:space="0" w:color="999999"/>
@@ -8442,7 +8421,7 @@
         </w:tc>
         <w:tc>
           <w:tcPr>
-            <w:tcW w:w="1418" w:type="dxa"/>
+            <w:tcW w:w="1417" w:type="dxa"/>
             <w:tcBorders>
               <w:top w:val="single" w:sz="4" w:space="0" w:color="999999"/>
               <w:start w:val="single" w:sz="4" w:space="0" w:color="999999"/>
@@ -8512,7 +8491,7 @@
         </w:tc>
         <w:tc>
           <w:tcPr>
-            <w:tcW w:w="1399" w:type="dxa"/>
+            <w:tcW w:w="1400" w:type="dxa"/>
             <w:tcBorders>
               <w:top w:val="single" w:sz="4" w:space="0" w:color="999999"/>
               <w:start w:val="single" w:sz="4" w:space="0" w:color="999999"/>
@@ -8732,7 +8711,7 @@
         </w:tc>
         <w:tc>
           <w:tcPr>
-            <w:tcW w:w="1418" w:type="dxa"/>
+            <w:tcW w:w="1417" w:type="dxa"/>
             <w:tcBorders>
               <w:top w:val="single" w:sz="4" w:space="0" w:color="999999"/>
               <w:start w:val="single" w:sz="4" w:space="0" w:color="999999"/>
@@ -8802,7 +8781,7 @@
         </w:tc>
         <w:tc>
           <w:tcPr>
-            <w:tcW w:w="1399" w:type="dxa"/>
+            <w:tcW w:w="1400" w:type="dxa"/>
             <w:tcBorders>
               <w:top w:val="single" w:sz="4" w:space="0" w:color="999999"/>
               <w:start w:val="single" w:sz="4" w:space="0" w:color="999999"/>
@@ -9008,7 +8987,7 @@
         </w:tc>
         <w:tc>
           <w:tcPr>
-            <w:tcW w:w="1418" w:type="dxa"/>
+            <w:tcW w:w="1417" w:type="dxa"/>
             <w:tcBorders>
               <w:top w:val="single" w:sz="4" w:space="0" w:color="999999"/>
               <w:start w:val="single" w:sz="4" w:space="0" w:color="999999"/>
@@ -9079,7 +9058,7 @@
         </w:tc>
         <w:tc>
           <w:tcPr>
-            <w:tcW w:w="1399" w:type="dxa"/>
+            <w:tcW w:w="1400" w:type="dxa"/>
             <w:tcBorders>
               <w:top w:val="single" w:sz="4" w:space="0" w:color="999999"/>
               <w:start w:val="single" w:sz="4" w:space="0" w:color="999999"/>
@@ -9284,7 +9263,7 @@
         </w:tc>
         <w:tc>
           <w:tcPr>
-            <w:tcW w:w="1418" w:type="dxa"/>
+            <w:tcW w:w="1417" w:type="dxa"/>
             <w:tcBorders>
               <w:top w:val="single" w:sz="4" w:space="0" w:color="999999"/>
               <w:start w:val="single" w:sz="4" w:space="0" w:color="999999"/>
@@ -9354,7 +9333,7 @@
         </w:tc>
         <w:tc>
           <w:tcPr>
-            <w:tcW w:w="1399" w:type="dxa"/>
+            <w:tcW w:w="1400" w:type="dxa"/>
             <w:tcBorders>
               <w:top w:val="single" w:sz="4" w:space="0" w:color="999999"/>
               <w:start w:val="single" w:sz="4" w:space="0" w:color="999999"/>
@@ -9574,7 +9553,7 @@
         </w:tc>
         <w:tc>
           <w:tcPr>
-            <w:tcW w:w="1418" w:type="dxa"/>
+            <w:tcW w:w="1417" w:type="dxa"/>
             <w:tcBorders>
               <w:top w:val="single" w:sz="4" w:space="0" w:color="999999"/>
               <w:start w:val="single" w:sz="4" w:space="0" w:color="999999"/>
@@ -9644,7 +9623,7 @@
         </w:tc>
         <w:tc>
           <w:tcPr>
-            <w:tcW w:w="1399" w:type="dxa"/>
+            <w:tcW w:w="1400" w:type="dxa"/>
             <w:tcBorders>
               <w:top w:val="single" w:sz="4" w:space="0" w:color="999999"/>
               <w:start w:val="single" w:sz="4" w:space="0" w:color="999999"/>
@@ -9861,7 +9840,7 @@
         </w:tc>
         <w:tc>
           <w:tcPr>
-            <w:tcW w:w="1418" w:type="dxa"/>
+            <w:tcW w:w="1417" w:type="dxa"/>
             <w:tcBorders>
               <w:top w:val="single" w:sz="4" w:space="0" w:color="999999"/>
               <w:start w:val="single" w:sz="4" w:space="0" w:color="999999"/>
@@ -9931,7 +9910,7 @@
         </w:tc>
         <w:tc>
           <w:tcPr>
-            <w:tcW w:w="1399" w:type="dxa"/>
+            <w:tcW w:w="1400" w:type="dxa"/>
             <w:tcBorders>
               <w:top w:val="single" w:sz="4" w:space="0" w:color="999999"/>
               <w:start w:val="single" w:sz="4" w:space="0" w:color="999999"/>
@@ -10151,7 +10130,7 @@
         </w:tc>
         <w:tc>
           <w:tcPr>
-            <w:tcW w:w="1418" w:type="dxa"/>
+            <w:tcW w:w="1417" w:type="dxa"/>
             <w:tcBorders>
               <w:top w:val="single" w:sz="4" w:space="0" w:color="999999"/>
               <w:start w:val="single" w:sz="4" w:space="0" w:color="999999"/>
@@ -10223,7 +10202,7 @@
         </w:tc>
         <w:tc>
           <w:tcPr>
-            <w:tcW w:w="1399" w:type="dxa"/>
+            <w:tcW w:w="1400" w:type="dxa"/>
             <w:tcBorders>
               <w:top w:val="single" w:sz="4" w:space="0" w:color="999999"/>
               <w:start w:val="single" w:sz="4" w:space="0" w:color="999999"/>
@@ -10443,7 +10422,7 @@
         </w:tc>
         <w:tc>
           <w:tcPr>
-            <w:tcW w:w="1418" w:type="dxa"/>
+            <w:tcW w:w="1417" w:type="dxa"/>
             <w:tcBorders>
               <w:top w:val="single" w:sz="4" w:space="0" w:color="999999"/>
               <w:start w:val="single" w:sz="4" w:space="0" w:color="999999"/>
@@ -10514,7 +10493,7 @@
         </w:tc>
         <w:tc>
           <w:tcPr>
-            <w:tcW w:w="1399" w:type="dxa"/>
+            <w:tcW w:w="1400" w:type="dxa"/>
             <w:tcBorders>
               <w:top w:val="single" w:sz="4" w:space="0" w:color="999999"/>
               <w:start w:val="single" w:sz="4" w:space="0" w:color="999999"/>
@@ -10733,7 +10712,7 @@
         </w:tc>
         <w:tc>
           <w:tcPr>
-            <w:tcW w:w="1418" w:type="dxa"/>
+            <w:tcW w:w="1417" w:type="dxa"/>
             <w:tcBorders>
               <w:top w:val="single" w:sz="4" w:space="0" w:color="999999"/>
               <w:start w:val="single" w:sz="4" w:space="0" w:color="999999"/>
@@ -10803,7 +10782,7 @@
         </w:tc>
         <w:tc>
           <w:tcPr>
-            <w:tcW w:w="1399" w:type="dxa"/>
+            <w:tcW w:w="1400" w:type="dxa"/>
             <w:tcBorders>
               <w:top w:val="single" w:sz="4" w:space="0" w:color="999999"/>
               <w:start w:val="single" w:sz="4" w:space="0" w:color="999999"/>
@@ -11020,7 +10999,7 @@
         </w:tc>
         <w:tc>
           <w:tcPr>
-            <w:tcW w:w="1418" w:type="dxa"/>
+            <w:tcW w:w="1417" w:type="dxa"/>
             <w:tcBorders>
               <w:top w:val="single" w:sz="4" w:space="0" w:color="999999"/>
               <w:start w:val="single" w:sz="4" w:space="0" w:color="999999"/>
@@ -11090,7 +11069,7 @@
         </w:tc>
         <w:tc>
           <w:tcPr>
-            <w:tcW w:w="1399" w:type="dxa"/>
+            <w:tcW w:w="1400" w:type="dxa"/>
             <w:tcBorders>
               <w:top w:val="single" w:sz="4" w:space="0" w:color="999999"/>
               <w:start w:val="single" w:sz="4" w:space="0" w:color="999999"/>
@@ -11308,7 +11287,7 @@
         </w:tc>
         <w:tc>
           <w:tcPr>
-            <w:tcW w:w="1418" w:type="dxa"/>
+            <w:tcW w:w="1417" w:type="dxa"/>
             <w:tcBorders>
               <w:top w:val="single" w:sz="4" w:space="0" w:color="999999"/>
               <w:start w:val="single" w:sz="4" w:space="0" w:color="999999"/>
@@ -11379,7 +11358,7 @@
         </w:tc>
         <w:tc>
           <w:tcPr>
-            <w:tcW w:w="1399" w:type="dxa"/>
+            <w:tcW w:w="1400" w:type="dxa"/>
             <w:tcBorders>
               <w:top w:val="single" w:sz="4" w:space="0" w:color="999999"/>
               <w:start w:val="single" w:sz="4" w:space="0" w:color="999999"/>
@@ -11601,7 +11580,7 @@
         </w:tc>
         <w:tc>
           <w:tcPr>
-            <w:tcW w:w="1418" w:type="dxa"/>
+            <w:tcW w:w="1417" w:type="dxa"/>
             <w:tcBorders>
               <w:top w:val="single" w:sz="4" w:space="0" w:color="999999"/>
               <w:start w:val="single" w:sz="4" w:space="0" w:color="999999"/>
@@ -11671,7 +11650,7 @@
         </w:tc>
         <w:tc>
           <w:tcPr>
-            <w:tcW w:w="1399" w:type="dxa"/>
+            <w:tcW w:w="1400" w:type="dxa"/>
             <w:tcBorders>
               <w:top w:val="single" w:sz="4" w:space="0" w:color="999999"/>
               <w:start w:val="single" w:sz="4" w:space="0" w:color="999999"/>
@@ -11890,7 +11869,7 @@
         </w:tc>
         <w:tc>
           <w:tcPr>
-            <w:tcW w:w="1418" w:type="dxa"/>
+            <w:tcW w:w="1417" w:type="dxa"/>
             <w:tcBorders>
               <w:top w:val="single" w:sz="4" w:space="0" w:color="999999"/>
               <w:start w:val="single" w:sz="4" w:space="0" w:color="999999"/>
@@ -11960,7 +11939,7 @@
         </w:tc>
         <w:tc>
           <w:tcPr>
-            <w:tcW w:w="1399" w:type="dxa"/>
+            <w:tcW w:w="1400" w:type="dxa"/>
             <w:tcBorders>
               <w:top w:val="single" w:sz="4" w:space="0" w:color="999999"/>
               <w:start w:val="single" w:sz="4" w:space="0" w:color="999999"/>
@@ -12176,7 +12155,7 @@
         </w:tc>
         <w:tc>
           <w:tcPr>
-            <w:tcW w:w="1418" w:type="dxa"/>
+            <w:tcW w:w="1417" w:type="dxa"/>
             <w:tcBorders>
               <w:top w:val="single" w:sz="4" w:space="0" w:color="999999"/>
               <w:start w:val="single" w:sz="4" w:space="0" w:color="999999"/>
@@ -12247,7 +12226,7 @@
         </w:tc>
         <w:tc>
           <w:tcPr>
-            <w:tcW w:w="1399" w:type="dxa"/>
+            <w:tcW w:w="1400" w:type="dxa"/>
             <w:tcBorders>
               <w:top w:val="single" w:sz="4" w:space="0" w:color="999999"/>
               <w:start w:val="single" w:sz="4" w:space="0" w:color="999999"/>
@@ -12462,7 +12441,7 @@
         </w:tc>
         <w:tc>
           <w:tcPr>
-            <w:tcW w:w="1418" w:type="dxa"/>
+            <w:tcW w:w="1417" w:type="dxa"/>
             <w:tcBorders>
               <w:top w:val="single" w:sz="4" w:space="0" w:color="999999"/>
               <w:start w:val="single" w:sz="4" w:space="0" w:color="999999"/>
@@ -12532,7 +12511,7 @@
         </w:tc>
         <w:tc>
           <w:tcPr>
-            <w:tcW w:w="1399" w:type="dxa"/>
+            <w:tcW w:w="1400" w:type="dxa"/>
             <w:tcBorders>
               <w:top w:val="single" w:sz="4" w:space="0" w:color="999999"/>
               <w:start w:val="single" w:sz="4" w:space="0" w:color="999999"/>
@@ -12747,7 +12726,7 @@
         </w:tc>
         <w:tc>
           <w:tcPr>
-            <w:tcW w:w="1418" w:type="dxa"/>
+            <w:tcW w:w="1417" w:type="dxa"/>
             <w:tcBorders>
               <w:top w:val="single" w:sz="4" w:space="0" w:color="999999"/>
               <w:start w:val="single" w:sz="4" w:space="0" w:color="999999"/>
@@ -12817,7 +12796,7 @@
         </w:tc>
         <w:tc>
           <w:tcPr>
-            <w:tcW w:w="1399" w:type="dxa"/>
+            <w:tcW w:w="1400" w:type="dxa"/>
             <w:tcBorders>
               <w:top w:val="single" w:sz="4" w:space="0" w:color="999999"/>
               <w:start w:val="single" w:sz="4" w:space="0" w:color="999999"/>
@@ -13037,7 +13016,7 @@
         </w:tc>
         <w:tc>
           <w:tcPr>
-            <w:tcW w:w="1418" w:type="dxa"/>
+            <w:tcW w:w="1417" w:type="dxa"/>
             <w:tcBorders>
               <w:top w:val="single" w:sz="4" w:space="0" w:color="999999"/>
               <w:start w:val="single" w:sz="4" w:space="0" w:color="999999"/>
@@ -13108,7 +13087,7 @@
         </w:tc>
         <w:tc>
           <w:tcPr>
-            <w:tcW w:w="1399" w:type="dxa"/>
+            <w:tcW w:w="1400" w:type="dxa"/>
             <w:tcBorders>
               <w:top w:val="single" w:sz="4" w:space="0" w:color="999999"/>
               <w:start w:val="single" w:sz="4" w:space="0" w:color="999999"/>
@@ -13326,7 +13305,7 @@
         </w:tc>
         <w:tc>
           <w:tcPr>
-            <w:tcW w:w="1418" w:type="dxa"/>
+            <w:tcW w:w="1417" w:type="dxa"/>
             <w:tcBorders>
               <w:top w:val="single" w:sz="4" w:space="0" w:color="999999"/>
               <w:start w:val="single" w:sz="4" w:space="0" w:color="999999"/>
@@ -13396,7 +13375,7 @@
         </w:tc>
         <w:tc>
           <w:tcPr>
-            <w:tcW w:w="1399" w:type="dxa"/>
+            <w:tcW w:w="1400" w:type="dxa"/>
             <w:tcBorders>
               <w:top w:val="single" w:sz="4" w:space="0" w:color="999999"/>
               <w:start w:val="single" w:sz="4" w:space="0" w:color="999999"/>
@@ -13602,7 +13581,7 @@
         </w:tc>
         <w:tc>
           <w:tcPr>
-            <w:tcW w:w="1418" w:type="dxa"/>
+            <w:tcW w:w="1417" w:type="dxa"/>
             <w:tcBorders>
               <w:top w:val="single" w:sz="4" w:space="0" w:color="999999"/>
               <w:start w:val="single" w:sz="4" w:space="0" w:color="999999"/>
@@ -13673,7 +13652,7 @@
         </w:tc>
         <w:tc>
           <w:tcPr>
-            <w:tcW w:w="1399" w:type="dxa"/>
+            <w:tcW w:w="1400" w:type="dxa"/>
             <w:tcBorders>
               <w:top w:val="single" w:sz="4" w:space="0" w:color="999999"/>
               <w:start w:val="single" w:sz="4" w:space="0" w:color="999999"/>
@@ -13890,7 +13869,7 @@
         </w:tc>
         <w:tc>
           <w:tcPr>
-            <w:tcW w:w="1418" w:type="dxa"/>
+            <w:tcW w:w="1417" w:type="dxa"/>
             <w:tcBorders>
               <w:top w:val="single" w:sz="4" w:space="0" w:color="999999"/>
               <w:start w:val="single" w:sz="4" w:space="0" w:color="999999"/>
@@ -13961,7 +13940,7 @@
         </w:tc>
         <w:tc>
           <w:tcPr>
-            <w:tcW w:w="1399" w:type="dxa"/>
+            <w:tcW w:w="1400" w:type="dxa"/>
             <w:tcBorders>
               <w:top w:val="single" w:sz="4" w:space="0" w:color="999999"/>
               <w:start w:val="single" w:sz="4" w:space="0" w:color="999999"/>
@@ -14182,7 +14161,7 @@
         </w:tc>
         <w:tc>
           <w:tcPr>
-            <w:tcW w:w="1418" w:type="dxa"/>
+            <w:tcW w:w="1417" w:type="dxa"/>
             <w:tcBorders>
               <w:top w:val="single" w:sz="4" w:space="0" w:color="999999"/>
               <w:start w:val="single" w:sz="4" w:space="0" w:color="999999"/>
@@ -14254,7 +14233,7 @@
         </w:tc>
         <w:tc>
           <w:tcPr>
-            <w:tcW w:w="1399" w:type="dxa"/>
+            <w:tcW w:w="1400" w:type="dxa"/>
             <w:tcBorders>
               <w:top w:val="single" w:sz="4" w:space="0" w:color="999999"/>
               <w:start w:val="single" w:sz="4" w:space="0" w:color="999999"/>
@@ -14464,7 +14443,7 @@
         </w:tc>
         <w:tc>
           <w:tcPr>
-            <w:tcW w:w="1418" w:type="dxa"/>
+            <w:tcW w:w="1417" w:type="dxa"/>
             <w:tcBorders>
               <w:top w:val="single" w:sz="4" w:space="0" w:color="999999"/>
               <w:start w:val="single" w:sz="4" w:space="0" w:color="999999"/>
@@ -14535,7 +14514,7 @@
         </w:tc>
         <w:tc>
           <w:tcPr>
-            <w:tcW w:w="1399" w:type="dxa"/>
+            <w:tcW w:w="1400" w:type="dxa"/>
             <w:tcBorders>
               <w:top w:val="single" w:sz="4" w:space="0" w:color="999999"/>
               <w:start w:val="single" w:sz="4" w:space="0" w:color="999999"/>
@@ -14753,7 +14732,7 @@
         </w:tc>
         <w:tc>
           <w:tcPr>
-            <w:tcW w:w="1418" w:type="dxa"/>
+            <w:tcW w:w="1417" w:type="dxa"/>
             <w:tcBorders>
               <w:top w:val="single" w:sz="4" w:space="0" w:color="999999"/>
               <w:start w:val="single" w:sz="4" w:space="0" w:color="999999"/>
@@ -14825,7 +14804,7 @@
         </w:tc>
         <w:tc>
           <w:tcPr>
-            <w:tcW w:w="1399" w:type="dxa"/>
+            <w:tcW w:w="1400" w:type="dxa"/>
             <w:tcBorders>
               <w:top w:val="single" w:sz="4" w:space="0" w:color="999999"/>
               <w:start w:val="single" w:sz="4" w:space="0" w:color="999999"/>
@@ -15046,7 +15025,7 @@
         </w:tc>
         <w:tc>
           <w:tcPr>
-            <w:tcW w:w="1418" w:type="dxa"/>
+            <w:tcW w:w="1417" w:type="dxa"/>
             <w:tcBorders>
               <w:top w:val="single" w:sz="4" w:space="0" w:color="999999"/>
               <w:start w:val="single" w:sz="4" w:space="0" w:color="999999"/>
@@ -15118,7 +15097,7 @@
         </w:tc>
         <w:tc>
           <w:tcPr>
-            <w:tcW w:w="1399" w:type="dxa"/>
+            <w:tcW w:w="1400" w:type="dxa"/>
             <w:tcBorders>
               <w:top w:val="single" w:sz="4" w:space="0" w:color="999999"/>
               <w:start w:val="single" w:sz="4" w:space="0" w:color="999999"/>
@@ -15339,7 +15318,7 @@
         </w:tc>
         <w:tc>
           <w:tcPr>
-            <w:tcW w:w="1418" w:type="dxa"/>
+            <w:tcW w:w="1417" w:type="dxa"/>
             <w:tcBorders>
               <w:top w:val="single" w:sz="4" w:space="0" w:color="999999"/>
               <w:start w:val="single" w:sz="4" w:space="0" w:color="999999"/>
@@ -15410,7 +15389,7 @@
         </w:tc>
         <w:tc>
           <w:tcPr>
-            <w:tcW w:w="1399" w:type="dxa"/>
+            <w:tcW w:w="1400" w:type="dxa"/>
             <w:tcBorders>
               <w:top w:val="single" w:sz="4" w:space="0" w:color="999999"/>
               <w:start w:val="single" w:sz="4" w:space="0" w:color="999999"/>
@@ -15628,7 +15607,7 @@
         </w:tc>
         <w:tc>
           <w:tcPr>
-            <w:tcW w:w="1418" w:type="dxa"/>
+            <w:tcW w:w="1417" w:type="dxa"/>
             <w:tcBorders>
               <w:top w:val="single" w:sz="4" w:space="0" w:color="999999"/>
               <w:start w:val="single" w:sz="4" w:space="0" w:color="999999"/>
@@ -15699,7 +15678,7 @@
         </w:tc>
         <w:tc>
           <w:tcPr>
-            <w:tcW w:w="1399" w:type="dxa"/>
+            <w:tcW w:w="1400" w:type="dxa"/>
             <w:tcBorders>
               <w:top w:val="single" w:sz="4" w:space="0" w:color="999999"/>
               <w:start w:val="single" w:sz="4" w:space="0" w:color="999999"/>
@@ -15920,7 +15899,7 @@
         </w:tc>
         <w:tc>
           <w:tcPr>
-            <w:tcW w:w="1418" w:type="dxa"/>
+            <w:tcW w:w="1417" w:type="dxa"/>
             <w:tcBorders>
               <w:top w:val="single" w:sz="4" w:space="0" w:color="999999"/>
               <w:start w:val="single" w:sz="4" w:space="0" w:color="999999"/>
@@ -15991,7 +15970,7 @@
         </w:tc>
         <w:tc>
           <w:tcPr>
-            <w:tcW w:w="1399" w:type="dxa"/>
+            <w:tcW w:w="1400" w:type="dxa"/>
             <w:tcBorders>
               <w:top w:val="single" w:sz="4" w:space="0" w:color="999999"/>
               <w:start w:val="single" w:sz="4" w:space="0" w:color="999999"/>
@@ -16211,7 +16190,7 @@
         </w:tc>
         <w:tc>
           <w:tcPr>
-            <w:tcW w:w="1418" w:type="dxa"/>
+            <w:tcW w:w="1417" w:type="dxa"/>
             <w:tcBorders>
               <w:top w:val="single" w:sz="4" w:space="0" w:color="999999"/>
               <w:start w:val="single" w:sz="4" w:space="0" w:color="999999"/>
@@ -16281,7 +16260,7 @@
         </w:tc>
         <w:tc>
           <w:tcPr>
-            <w:tcW w:w="1399" w:type="dxa"/>
+            <w:tcW w:w="1400" w:type="dxa"/>
             <w:tcBorders>
               <w:top w:val="single" w:sz="4" w:space="0" w:color="999999"/>
               <w:start w:val="single" w:sz="4" w:space="0" w:color="999999"/>
@@ -16496,7 +16475,7 @@
         </w:tc>
         <w:tc>
           <w:tcPr>
-            <w:tcW w:w="1418" w:type="dxa"/>
+            <w:tcW w:w="1417" w:type="dxa"/>
             <w:tcBorders>
               <w:top w:val="single" w:sz="4" w:space="0" w:color="999999"/>
               <w:start w:val="single" w:sz="4" w:space="0" w:color="999999"/>
@@ -16566,7 +16545,7 @@
         </w:tc>
         <w:tc>
           <w:tcPr>
-            <w:tcW w:w="1399" w:type="dxa"/>
+            <w:tcW w:w="1400" w:type="dxa"/>
             <w:tcBorders>
               <w:top w:val="single" w:sz="4" w:space="0" w:color="999999"/>
               <w:start w:val="single" w:sz="4" w:space="0" w:color="999999"/>
@@ -16784,7 +16763,7 @@
         </w:tc>
         <w:tc>
           <w:tcPr>
-            <w:tcW w:w="1418" w:type="dxa"/>
+            <w:tcW w:w="1417" w:type="dxa"/>
             <w:tcBorders>
               <w:top w:val="single" w:sz="4" w:space="0" w:color="999999"/>
               <w:start w:val="single" w:sz="4" w:space="0" w:color="999999"/>
@@ -16855,7 +16834,7 @@
         </w:tc>
         <w:tc>
           <w:tcPr>
-            <w:tcW w:w="1399" w:type="dxa"/>
+            <w:tcW w:w="1400" w:type="dxa"/>
             <w:tcBorders>
               <w:top w:val="single" w:sz="4" w:space="0" w:color="999999"/>
               <w:start w:val="single" w:sz="4" w:space="0" w:color="999999"/>
@@ -17070,7 +17049,7 @@
         </w:tc>
         <w:tc>
           <w:tcPr>
-            <w:tcW w:w="1418" w:type="dxa"/>
+            <w:tcW w:w="1417" w:type="dxa"/>
             <w:tcBorders>
               <w:top w:val="single" w:sz="4" w:space="0" w:color="999999"/>
               <w:start w:val="single" w:sz="4" w:space="0" w:color="999999"/>
@@ -17140,7 +17119,7 @@
         </w:tc>
         <w:tc>
           <w:tcPr>
-            <w:tcW w:w="1399" w:type="dxa"/>
+            <w:tcW w:w="1400" w:type="dxa"/>
             <w:tcBorders>
               <w:top w:val="single" w:sz="4" w:space="0" w:color="999999"/>
               <w:start w:val="single" w:sz="4" w:space="0" w:color="999999"/>
@@ -17359,7 +17338,7 @@
         </w:tc>
         <w:tc>
           <w:tcPr>
-            <w:tcW w:w="1418" w:type="dxa"/>
+            <w:tcW w:w="1417" w:type="dxa"/>
             <w:tcBorders>
               <w:top w:val="single" w:sz="4" w:space="0" w:color="999999"/>
               <w:start w:val="single" w:sz="4" w:space="0" w:color="999999"/>
@@ -17429,7 +17408,7 @@
         </w:tc>
         <w:tc>
           <w:tcPr>
-            <w:tcW w:w="1399" w:type="dxa"/>
+            <w:tcW w:w="1400" w:type="dxa"/>
             <w:tcBorders>
               <w:top w:val="single" w:sz="4" w:space="0" w:color="999999"/>
               <w:start w:val="single" w:sz="4" w:space="0" w:color="999999"/>
@@ -17645,7 +17624,7 @@
         </w:tc>
         <w:tc>
           <w:tcPr>
-            <w:tcW w:w="1418" w:type="dxa"/>
+            <w:tcW w:w="1417" w:type="dxa"/>
             <w:tcBorders>
               <w:top w:val="single" w:sz="4" w:space="0" w:color="999999"/>
               <w:start w:val="single" w:sz="4" w:space="0" w:color="999999"/>
@@ -17716,7 +17695,7 @@
         </w:tc>
         <w:tc>
           <w:tcPr>
-            <w:tcW w:w="1399" w:type="dxa"/>
+            <w:tcW w:w="1400" w:type="dxa"/>
             <w:tcBorders>
               <w:top w:val="single" w:sz="4" w:space="0" w:color="999999"/>
               <w:start w:val="single" w:sz="4" w:space="0" w:color="999999"/>
@@ -17932,7 +17911,7 @@
         </w:tc>
         <w:tc>
           <w:tcPr>
-            <w:tcW w:w="1418" w:type="dxa"/>
+            <w:tcW w:w="1417" w:type="dxa"/>
             <w:tcBorders>
               <w:top w:val="single" w:sz="4" w:space="0" w:color="999999"/>
               <w:start w:val="single" w:sz="4" w:space="0" w:color="999999"/>
@@ -18002,7 +17981,7 @@
         </w:tc>
         <w:tc>
           <w:tcPr>
-            <w:tcW w:w="1399" w:type="dxa"/>
+            <w:tcW w:w="1400" w:type="dxa"/>
             <w:tcBorders>
               <w:top w:val="single" w:sz="4" w:space="0" w:color="999999"/>
               <w:start w:val="single" w:sz="4" w:space="0" w:color="999999"/>
@@ -18223,7 +18202,7 @@
         </w:tc>
         <w:tc>
           <w:tcPr>
-            <w:tcW w:w="1418" w:type="dxa"/>
+            <w:tcW w:w="1417" w:type="dxa"/>
             <w:tcBorders>
               <w:top w:val="single" w:sz="4" w:space="0" w:color="999999"/>
               <w:start w:val="single" w:sz="4" w:space="0" w:color="999999"/>
@@ -18295,7 +18274,7 @@
         </w:tc>
         <w:tc>
           <w:tcPr>
-            <w:tcW w:w="1399" w:type="dxa"/>
+            <w:tcW w:w="1400" w:type="dxa"/>
             <w:tcBorders>
               <w:top w:val="single" w:sz="4" w:space="0" w:color="999999"/>
               <w:start w:val="single" w:sz="4" w:space="0" w:color="999999"/>
@@ -20516,13 +20495,22 @@
       </w:r>
       <w:r>
         <w:rPr>
+          <w:b/>
+          <w:bCs/>
+          <w:sz w:val="18"/>
+          <w:szCs w:val="18"/>
+        </w:rPr>
+        <w:t>N</w:t>
+      </w:r>
+      <w:r>
+        <w:rPr>
           <w:rFonts w:hint="eastAsia"/>
           <w:b/>
           <w:bCs/>
           <w:sz w:val="18"/>
           <w:szCs w:val="18"/>
         </w:rPr>
-        <w:t xml:space="preserve">Characterization of two novel signatures associated RNase H2 deficiency </w:t>
+        <w:t xml:space="preserve">ovel signature </w:t>
       </w:r>
       <w:r>
         <w:rPr>
@@ -20532,7 +20520,7 @@
           <w:sz w:val="18"/>
           <w:szCs w:val="18"/>
         </w:rPr>
-        <w:t xml:space="preserve">and </w:t>
+        <w:t>caused by</w:t>
       </w:r>
       <w:r>
         <w:rPr>
@@ -20542,8 +20530,20 @@
           <w:sz w:val="18"/>
           <w:szCs w:val="18"/>
         </w:rPr>
-        <w:t xml:space="preserve">topoisomerase-1-associated mutagenesis </w:t>
-      </w:r>
+        <w:t xml:space="preserve"> RNase H2 deficiency and topoisomerase-1-associated mutagenesis (TOP1-TAM)</w:t>
+      </w:r>
+    </w:p>
+    <w:p>
+      <w:pPr>
+        <w:pStyle w:val="Normal"/>
+        <w:spacing w:lineRule="auto" w:line="240" w:before="0" w:after="0"/>
+        <w:ind w:hanging="0"/>
+        <w:rPr>
+          <w:rFonts w:eastAsia="宋体" w:eastAsiaTheme="minorEastAsia"/>
+          <w:sz w:val="18"/>
+          <w:szCs w:val="18"/>
+        </w:rPr>
+      </w:pPr>
       <w:r>
         <w:rPr>
           <w:rFonts w:hint="eastAsia"/>
@@ -20552,7 +20552,47 @@
           <w:sz w:val="18"/>
           <w:szCs w:val="18"/>
         </w:rPr>
-        <w:t>(TOP1-TAM)</w:t>
+        <w:t>(A)</w:t>
+      </w:r>
+      <w:r>
+        <w:rPr>
+          <w:rFonts w:hint="eastAsia"/>
+          <w:sz w:val="18"/>
+          <w:szCs w:val="18"/>
+        </w:rPr>
+        <w:t xml:space="preserve"> The mutational signature of RNase H2 deficiency</w:t>
+      </w:r>
+      <w:r>
+        <w:rPr>
+          <w:rFonts w:hint="eastAsia"/>
+          <w:sz w:val="18"/>
+          <w:szCs w:val="18"/>
+          <w:shd w:fill="auto" w:val="clear"/>
+        </w:rPr>
+        <w:t xml:space="preserve"> </w:t>
+      </w:r>
+      <w:r>
+        <w:rPr>
+          <w:rFonts w:hint="eastAsia"/>
+          <w:sz w:val="18"/>
+          <w:szCs w:val="18"/>
+        </w:rPr>
+        <w:t xml:space="preserve">(InsDel_F in the 89-type classification, ID_F in the 83-type classification), and a previously identified mutational </w:t>
+      </w:r>
+      <w:r>
+        <w:rPr>
+          <w:sz w:val="18"/>
+          <w:szCs w:val="18"/>
+        </w:rPr>
+        <w:t>signature</w:t>
+      </w:r>
+      <w:r>
+        <w:rPr>
+          <w:rFonts w:hint="eastAsia"/>
+          <w:sz w:val="18"/>
+          <w:szCs w:val="18"/>
+        </w:rPr>
+        <w:t xml:space="preserve"> (InsDel4, C_ID4).</w:t>
       </w:r>
     </w:p>
     <w:p>
@@ -20574,7 +20614,17 @@
           <w:sz w:val="18"/>
           <w:szCs w:val="18"/>
         </w:rPr>
-        <w:t>(A)</w:t>
+        <w:t xml:space="preserve">(B) </w:t>
+      </w:r>
+      <w:r>
+        <w:rPr>
+          <w:rFonts w:hint="eastAsia"/>
+          <w:b w:val="false"/>
+          <w:bCs w:val="false"/>
+          <w:sz w:val="18"/>
+          <w:szCs w:val="18"/>
+        </w:rPr>
+        <w:t>D</w:t>
       </w:r>
       <w:r>
         <w:rPr>
@@ -20582,7 +20632,15 @@
           <w:sz w:val="18"/>
           <w:szCs w:val="18"/>
         </w:rPr>
-        <w:t xml:space="preserve"> The mutational signature of </w:t>
+        <w:t xml:space="preserve">eletions of </w:t>
+      </w:r>
+      <w:r>
+        <w:rPr>
+          <w:rFonts w:eastAsia="Liberation Serif" w:cs="Liberation Serif" w:hint="eastAsia" w:ascii="Liberation Serif" w:hAnsi="Liberation Serif"/>
+          <w:sz w:val="18"/>
+          <w:szCs w:val="18"/>
+        </w:rPr>
+        <w:t>≥</w:t>
       </w:r>
       <w:r>
         <w:rPr>
@@ -20590,116 +20648,8 @@
           <w:sz w:val="18"/>
           <w:szCs w:val="18"/>
         </w:rPr>
-        <w:t>RNase H2 deficiency</w:t>
-      </w:r>
-      <w:r>
-        <w:rPr>
-          <w:rFonts w:hint="eastAsia"/>
-          <w:sz w:val="18"/>
-          <w:szCs w:val="18"/>
-          <w:shd w:fill="auto" w:val="clear"/>
-        </w:rPr>
-        <w:t xml:space="preserve"> </w:t>
-      </w:r>
-      <w:r>
-        <w:rPr>
-          <w:rFonts w:hint="eastAsia"/>
-          <w:sz w:val="18"/>
-          <w:szCs w:val="18"/>
-        </w:rPr>
-        <w:t>(</w:t>
-      </w:r>
-      <w:r>
-        <w:rPr>
-          <w:rFonts w:hint="eastAsia"/>
-          <w:sz w:val="18"/>
-          <w:szCs w:val="18"/>
-        </w:rPr>
-        <w:t xml:space="preserve">InsDel_F in the 89-type classification, </w:t>
-      </w:r>
-      <w:r>
-        <w:rPr>
-          <w:rFonts w:hint="eastAsia"/>
-          <w:sz w:val="18"/>
-          <w:szCs w:val="18"/>
-        </w:rPr>
-        <w:t xml:space="preserve">ID_F </w:t>
-      </w:r>
-      <w:r>
-        <w:rPr>
-          <w:rFonts w:hint="eastAsia"/>
-          <w:sz w:val="18"/>
-          <w:szCs w:val="18"/>
-        </w:rPr>
-        <w:t>in the 83-type classification</w:t>
-      </w:r>
-      <w:r>
-        <w:rPr>
-          <w:rFonts w:hint="eastAsia"/>
-          <w:sz w:val="18"/>
-          <w:szCs w:val="18"/>
-        </w:rPr>
-        <w:t xml:space="preserve">), and a previously identified mutational </w:t>
-      </w:r>
-      <w:r>
-        <w:rPr>
-          <w:sz w:val="18"/>
-          <w:szCs w:val="18"/>
-        </w:rPr>
-        <w:t>signature</w:t>
-      </w:r>
-      <w:r>
-        <w:rPr>
-          <w:rFonts w:hint="eastAsia"/>
-          <w:sz w:val="18"/>
-          <w:szCs w:val="18"/>
-        </w:rPr>
-        <w:t xml:space="preserve"> </w:t>
-      </w:r>
-      <w:r>
-        <w:rPr>
-          <w:rFonts w:hint="eastAsia"/>
-          <w:sz w:val="18"/>
-          <w:szCs w:val="18"/>
-        </w:rPr>
-        <w:t xml:space="preserve">(InsDel4, </w:t>
-      </w:r>
-      <w:r>
-        <w:rPr>
-          <w:rFonts w:hint="eastAsia"/>
-          <w:sz w:val="18"/>
-          <w:szCs w:val="18"/>
-        </w:rPr>
-        <w:t>C_ID4</w:t>
-      </w:r>
-      <w:r>
-        <w:rPr>
-          <w:rFonts w:hint="eastAsia"/>
-          <w:sz w:val="18"/>
-          <w:szCs w:val="18"/>
-        </w:rPr>
-        <w:t>)</w:t>
-      </w:r>
-      <w:r>
-        <w:rPr>
-          <w:rFonts w:hint="eastAsia"/>
-          <w:sz w:val="18"/>
-          <w:szCs w:val="18"/>
-        </w:rPr>
-        <w:t>.</w:t>
-      </w:r>
-    </w:p>
-    <w:p>
-      <w:pPr>
-        <w:pStyle w:val="Normal"/>
-        <w:spacing w:lineRule="auto" w:line="240" w:before="0" w:after="0"/>
-        <w:ind w:hanging="0"/>
-        <w:rPr>
-          <w:rFonts w:eastAsia="宋体" w:eastAsiaTheme="minorEastAsia"/>
-          <w:sz w:val="18"/>
-          <w:szCs w:val="18"/>
-        </w:rPr>
-      </w:pPr>
+        <w:t xml:space="preserve"> 2 bases in the 476-type classification scheme in InsDel_F compared to InsDel4. InsDel4 has substantial proportions of deletions of 3 and 4 bases (Del3:U2:R2, Del4:U4:R2, Del3:M2, Del4:M2, Del4:M3) that are essentially absent in InsDel_F. Refer to panel </w:t>
+      </w:r>
       <w:r>
         <w:rPr>
           <w:rFonts w:hint="eastAsia"/>
@@ -20708,7 +20658,53 @@
           <w:sz w:val="18"/>
           <w:szCs w:val="18"/>
         </w:rPr>
-        <w:t xml:space="preserve">(B) </w:t>
+        <w:t>B</w:t>
+      </w:r>
+      <w:r>
+        <w:rPr>
+          <w:rFonts w:hint="eastAsia"/>
+          <w:sz w:val="18"/>
+          <w:szCs w:val="18"/>
+        </w:rPr>
+        <w:t xml:space="preserve"> for </w:t>
+      </w:r>
+      <w:r>
+        <w:rPr>
+          <w:rFonts w:hint="eastAsia"/>
+          <w:sz w:val="18"/>
+          <w:szCs w:val="18"/>
+        </w:rPr>
+        <w:t xml:space="preserve">additional </w:t>
+      </w:r>
+      <w:r>
+        <w:rPr>
+          <w:rFonts w:hint="eastAsia"/>
+          <w:sz w:val="18"/>
+          <w:szCs w:val="18"/>
+        </w:rPr>
+        <w:t xml:space="preserve">explanations of the mutation labels. </w:t>
+      </w:r>
+    </w:p>
+    <w:p>
+      <w:pPr>
+        <w:pStyle w:val="Normal"/>
+        <w:spacing w:lineRule="auto" w:line="240" w:before="0" w:after="0"/>
+        <w:ind w:hanging="0"/>
+        <w:rPr>
+          <w:rFonts w:eastAsia="宋体" w:eastAsiaTheme="minorEastAsia"/>
+          <w:sz w:val="18"/>
+          <w:szCs w:val="18"/>
+        </w:rPr>
+      </w:pPr>
+      <w:r>
+        <w:rPr>
+          <w:rFonts w:hint="eastAsia"/>
+          <w:b/>
+          <w:bCs/>
+          <w:sz w:val="18"/>
+          <w:szCs w:val="18"/>
+        </w:rPr>
+        <w:t xml:space="preserve">(C) </w:t>
       </w:r>
       <w:r>
         <w:rPr>
@@ -20718,7 +20714,14 @@
           <w:sz w:val="18"/>
           <w:szCs w:val="18"/>
         </w:rPr>
-        <w:t>D</w:t>
+        <w:t>Logos of the s</w:t>
+      </w:r>
+      <w:r>
+        <w:rPr>
+          <w:sz w:val="18"/>
+          <w:szCs w:val="18"/>
+        </w:rPr>
+        <w:t xml:space="preserve">equence contexts of </w:t>
       </w:r>
       <w:r>
         <w:rPr>
@@ -20726,222 +20729,7 @@
           <w:sz w:val="18"/>
           <w:szCs w:val="18"/>
         </w:rPr>
-        <w:t xml:space="preserve">eletions of </w:t>
-      </w:r>
-      <w:r>
-        <w:rPr>
-          <w:rFonts w:eastAsia="Liberation Serif" w:cs="Liberation Serif" w:hint="eastAsia" w:ascii="Liberation Serif" w:hAnsi="Liberation Serif"/>
-          <w:sz w:val="18"/>
-          <w:szCs w:val="18"/>
-        </w:rPr>
-        <w:t>≥</w:t>
-      </w:r>
-      <w:r>
-        <w:rPr>
-          <w:rFonts w:hint="eastAsia"/>
-          <w:sz w:val="18"/>
-          <w:szCs w:val="18"/>
-        </w:rPr>
-        <w:t xml:space="preserve"> </w:t>
-      </w:r>
-      <w:r>
-        <w:rPr>
-          <w:rFonts w:hint="eastAsia"/>
-          <w:sz w:val="18"/>
-          <w:szCs w:val="18"/>
-        </w:rPr>
-        <w:t xml:space="preserve">2 </w:t>
-      </w:r>
-      <w:r>
-        <w:rPr>
-          <w:rFonts w:hint="eastAsia"/>
-          <w:sz w:val="18"/>
-          <w:szCs w:val="18"/>
-        </w:rPr>
-        <w:t>bases</w:t>
-      </w:r>
-      <w:r>
-        <w:rPr>
-          <w:rFonts w:hint="eastAsia"/>
-          <w:sz w:val="18"/>
-          <w:szCs w:val="18"/>
-        </w:rPr>
-        <w:t xml:space="preserve"> in </w:t>
-      </w:r>
-      <w:r>
-        <w:rPr>
-          <w:rFonts w:hint="eastAsia"/>
-          <w:sz w:val="18"/>
-          <w:szCs w:val="18"/>
-        </w:rPr>
-        <w:t xml:space="preserve">the 476-type classification scheme in </w:t>
-      </w:r>
-      <w:r>
-        <w:rPr>
-          <w:rFonts w:hint="eastAsia"/>
-          <w:sz w:val="18"/>
-          <w:szCs w:val="18"/>
-        </w:rPr>
-        <w:t xml:space="preserve">InsDel_F </w:t>
-      </w:r>
-      <w:r>
-        <w:rPr>
-          <w:rFonts w:hint="eastAsia"/>
-          <w:sz w:val="18"/>
-          <w:szCs w:val="18"/>
-        </w:rPr>
-        <w:t>compared to</w:t>
-      </w:r>
-      <w:r>
-        <w:rPr>
-          <w:rFonts w:hint="eastAsia"/>
-          <w:sz w:val="18"/>
-          <w:szCs w:val="18"/>
-        </w:rPr>
-        <w:t xml:space="preserve"> InsDel4. </w:t>
-      </w:r>
-      <w:r>
-        <w:rPr>
-          <w:rFonts w:hint="eastAsia"/>
-          <w:sz w:val="18"/>
-          <w:szCs w:val="18"/>
-        </w:rPr>
-        <w:t xml:space="preserve">Refer to panel </w:t>
-      </w:r>
-      <w:r>
-        <w:rPr>
-          <w:rFonts w:hint="eastAsia"/>
-          <w:b/>
-          <w:bCs/>
-          <w:sz w:val="18"/>
-          <w:szCs w:val="18"/>
-        </w:rPr>
-        <w:t>B</w:t>
-      </w:r>
-      <w:r>
-        <w:rPr>
-          <w:rFonts w:hint="eastAsia"/>
-          <w:sz w:val="18"/>
-          <w:szCs w:val="18"/>
-        </w:rPr>
-        <w:t xml:space="preserve"> for explanations of the mutation labels. The InsDel4 signature has substantial proportions of deletions of 3 and 4 bases (Del3:U2:R2, Del4:U4:R2, Del3:M2, Del4:M2, Del4:M3) that are essentially absent in InsDel_F.</w:t>
-      </w:r>
-    </w:p>
-    <w:p>
-      <w:pPr>
-        <w:pStyle w:val="Normal"/>
-        <w:spacing w:lineRule="auto" w:line="240" w:before="0" w:after="0"/>
-        <w:ind w:hanging="0"/>
-        <w:rPr>
-          <w:rFonts w:eastAsia="宋体" w:eastAsiaTheme="minorEastAsia"/>
-          <w:sz w:val="18"/>
-          <w:szCs w:val="18"/>
-        </w:rPr>
-      </w:pPr>
-      <w:r>
-        <w:rPr>
-          <w:rFonts w:hint="eastAsia"/>
-          <w:b/>
-          <w:bCs/>
-          <w:sz w:val="18"/>
-          <w:szCs w:val="18"/>
-        </w:rPr>
-        <w:t xml:space="preserve">(C) </w:t>
-      </w:r>
-      <w:r>
-        <w:rPr>
-          <w:rFonts w:hint="eastAsia"/>
-          <w:b w:val="false"/>
-          <w:bCs w:val="false"/>
-          <w:sz w:val="18"/>
-          <w:szCs w:val="18"/>
-        </w:rPr>
-        <w:t>Logos of the s</w:t>
-      </w:r>
-      <w:r>
-        <w:rPr>
-          <w:sz w:val="18"/>
-          <w:szCs w:val="18"/>
-        </w:rPr>
-        <w:t>equence context</w:t>
-      </w:r>
-      <w:r>
-        <w:rPr>
-          <w:sz w:val="18"/>
-          <w:szCs w:val="18"/>
-        </w:rPr>
-        <w:t>s</w:t>
-      </w:r>
-      <w:r>
-        <w:rPr>
-          <w:sz w:val="18"/>
-          <w:szCs w:val="18"/>
-        </w:rPr>
-        <w:t xml:space="preserve"> of </w:t>
-      </w:r>
-      <w:r>
-        <w:rPr>
-          <w:rFonts w:hint="eastAsia"/>
-          <w:sz w:val="18"/>
-          <w:szCs w:val="18"/>
-        </w:rPr>
-        <w:t>2-</w:t>
-      </w:r>
-      <w:r>
-        <w:rPr>
-          <w:rFonts w:hint="eastAsia"/>
-          <w:sz w:val="18"/>
-          <w:szCs w:val="18"/>
-        </w:rPr>
-        <w:t>base deletions</w:t>
-      </w:r>
-      <w:r>
-        <w:rPr>
-          <w:rFonts w:hint="eastAsia"/>
-          <w:sz w:val="18"/>
-          <w:szCs w:val="18"/>
-        </w:rPr>
-        <w:t xml:space="preserve"> in 5 samples with the highest InsDel_F activity </w:t>
-      </w:r>
-      <w:r>
-        <w:rPr>
-          <w:rFonts w:hint="eastAsia"/>
-          <w:sz w:val="18"/>
-          <w:szCs w:val="18"/>
-        </w:rPr>
-        <w:t xml:space="preserve">(left) compared to 5 samples with the </w:t>
-      </w:r>
-      <w:r>
-        <w:rPr>
-          <w:rFonts w:hint="eastAsia"/>
-          <w:sz w:val="18"/>
-          <w:szCs w:val="18"/>
-        </w:rPr>
-        <w:t xml:space="preserve">highest InsDel4 activity </w:t>
-      </w:r>
-      <w:r>
-        <w:rPr>
-          <w:rFonts w:hint="eastAsia"/>
-          <w:sz w:val="18"/>
-          <w:szCs w:val="18"/>
-        </w:rPr>
-        <w:t>(right)</w:t>
-      </w:r>
-      <w:r>
-        <w:rPr>
-          <w:rFonts w:hint="eastAsia"/>
-          <w:sz w:val="18"/>
-          <w:szCs w:val="18"/>
-        </w:rPr>
-        <w:t xml:space="preserve">. </w:t>
-      </w:r>
-      <w:r>
-        <w:rPr>
-          <w:rFonts w:hint="eastAsia"/>
-          <w:sz w:val="18"/>
-          <w:szCs w:val="18"/>
-        </w:rPr>
-        <w:t xml:space="preserve">The sequence contexts of the 2-base deletions in InsDel_F are on the whole different from the contexts of 2-base deletions in InsDel4. In the lower two sections (DEL:MH:2:1, 2-base deletions with 1 base of microhomology), the microhomologous bases (T:A) are shaded orange. </w:t>
+        <w:t xml:space="preserve">2-base deletions in 5 samples with the highest InsDel_F activity (left) compared to 5 samples with the highest InsDel4 activity (right). The sequence contexts of the 2-base deletions in InsDel_F are on the whole different from the contexts of 2-base deletions in InsDel4. In the lower two sections (DEL:MH:2:1, 2-base deletions with 1 base of microhomology), the microhomologous bases (T:A) are shaded orange. </w:t>
       </w:r>
     </w:p>
     <w:p>
@@ -21002,8 +20790,8 @@
   <w:comment w:id="0" w:author="Mo Liu" w:date="2026-05-25T16:05:00Z" w:initials="ML">
     <w:p>
       <w:pPr>
-        <w:overflowPunct w:val="false"/>
-        <w:spacing w:before="0" w:after="0" w:lineRule="auto" w:line="240"/>
+        <w:overflowPunct w:val="true"/>
+        <w:spacing w:lineRule="auto" w:line="240" w:before="0" w:after="0"/>
         <w:rPr/>
       </w:pPr>
       <w:r>
@@ -21011,7 +20799,7 @@
       </w:r>
       <w:r>
         <w:rPr>
-          <w:rFonts w:cs="Noto Sans Arabic UI" w:eastAsia="宋体" w:ascii="Calibri" w:hAnsi="Calibri"/>
+          <w:rFonts w:eastAsia="宋体" w:cs="Noto Sans Arabic UI" w:ascii="Calibri" w:hAnsi="Calibri"/>
           <w:sz w:val="22"/>
           <w:szCs w:val="22"/>
         </w:rPr>
@@ -21022,8 +20810,8 @@
   <w:comment w:id="1" w:author="Mo Liu" w:date="2026-05-16T08:47:00Z" w:initials="ML">
     <w:p>
       <w:pPr>
-        <w:overflowPunct w:val="false"/>
-        <w:spacing w:before="0" w:after="0" w:lineRule="auto" w:line="240"/>
+        <w:overflowPunct w:val="true"/>
+        <w:spacing w:lineRule="auto" w:line="240" w:before="0" w:after="0"/>
         <w:rPr/>
       </w:pPr>
       <w:r>
@@ -21042,8 +20830,8 @@
   <w:comment w:id="2" w:author="Mo Liu" w:date="2026-05-20T09:26:00Z" w:initials="ML">
     <w:p>
       <w:pPr>
-        <w:overflowPunct w:val="false"/>
-        <w:spacing w:before="0" w:after="0" w:lineRule="auto" w:line="240"/>
+        <w:overflowPunct w:val="true"/>
+        <w:spacing w:lineRule="auto" w:line="240" w:before="0" w:after="0"/>
         <w:rPr/>
       </w:pPr>
       <w:r>
@@ -21062,8 +20850,8 @@
   <w:comment w:id="3" w:author="Mo Liu" w:date="2026-05-25T13:45:00Z" w:initials="ML">
     <w:p>
       <w:pPr>
-        <w:overflowPunct w:val="false"/>
-        <w:spacing w:before="0" w:after="0" w:lineRule="auto" w:line="240"/>
+        <w:overflowPunct w:val="true"/>
+        <w:spacing w:lineRule="auto" w:line="240" w:before="0" w:after="0"/>
         <w:rPr/>
       </w:pPr>
       <w:r>
@@ -21071,7 +20859,7 @@
       </w:r>
       <w:r>
         <w:rPr>
-          <w:rFonts w:cs="Noto Sans Arabic UI" w:eastAsia="宋体" w:ascii="Calibri" w:hAnsi="Calibri"/>
+          <w:rFonts w:eastAsia="宋体" w:cs="Noto Sans Arabic UI" w:ascii="Calibri" w:hAnsi="Calibri"/>
           <w:sz w:val="22"/>
           <w:szCs w:val="22"/>
         </w:rPr>
@@ -21087,8 +20875,7 @@
   <w:p>
     <w:pPr>
       <w:pStyle w:val="Footer"/>
-      <w:snapToGrid w:val="false"/>
-      <w:spacing w:lineRule="auto" w:line="240" w:before="0" w:after="160"/>
+      <w:spacing w:before="0" w:after="160"/>
       <w:rPr/>
     </w:pPr>
     <w:r>
@@ -22312,8 +22099,8 @@
       <w:szCs w:val="24"/>
     </w:rPr>
   </w:style>
-  <w:style w:type="character" w:styleId="Bulletsuser" w:customStyle="1">
-    <w:name w:val="Bullets (user)"/>
+  <w:style w:type="character" w:styleId="Bullets" w:customStyle="1">
+    <w:name w:val="Bullets"/>
     <w:qFormat/>
     <w:rPr>
       <w:rFonts w:ascii="OpenSymbol" w:hAnsi="OpenSymbol" w:eastAsia="OpenSymbol" w:cs="OpenSymbol"/>
@@ -22485,7 +22272,7 @@
       <w:jc w:val="start"/>
     </w:pPr>
     <w:rPr>
-      <w:rFonts w:eastAsia="DejaVu Sans" w:ascii="Calibri" w:hAnsi="Calibri" w:cs="Noto Sans Arabic UI"/>
+      <w:rFonts w:ascii="Calibri" w:hAnsi="Calibri" w:eastAsia="DejaVu Sans" w:cs="Noto Sans Arabic UI"/>
       <w:color w:val="auto"/>
       <w:kern w:val="0"/>
       <w:sz w:val="22"/>

</xml_diff>